<commit_message>
Flyer: the accent border goes on every module card
BetterStats had the green edge and the other five had the grey hairline. All six
carry the accent now. BetterStats is still the one that stands out, by its
tinted fill and its INCLUDED pill rather than by a border nobody else had.

Co-Authored-By: Claude Opus 5 <noreply@anthropic.com>
Claude-Session: https://claude.ai/code/session_01Y3EsCbhDUcDU73qj5Ntncm
</commit_message>
<xml_diff>
--- a/docs/flyer/BetterCricket_Flyer.docx
+++ b/docs/flyer/BetterCricket_Flyer.docx
@@ -2669,10 +2669,10 @@
           <w:tcPr>
             <w:tcW w:w="5044" w:type="dxa"/>
             <w:tcBorders>
-              <w:top w:val="single" w:sz="6" w:space="0" w:color="1D2331"/>
-              <w:left w:val="single" w:sz="6" w:space="0" w:color="1D2331"/>
-              <w:bottom w:val="single" w:sz="6" w:space="0" w:color="1D2331"/>
-              <w:right w:val="single" w:sz="6" w:space="0" w:color="1D2331"/>
+              <w:top w:val="single" w:sz="6" w:space="0" w:color="16C784"/>
+              <w:left w:val="single" w:sz="6" w:space="0" w:color="16C784"/>
+              <w:bottom w:val="single" w:sz="6" w:space="0" w:color="16C784"/>
+              <w:right w:val="single" w:sz="6" w:space="0" w:color="16C784"/>
             </w:tcBorders>
             <w:shd w:val="clear" w:color="auto" w:fill="101828"/>
             <w:tcMar>
@@ -3003,10 +3003,10 @@
           <w:tcPr>
             <w:tcW w:w="5044" w:type="dxa"/>
             <w:tcBorders>
-              <w:top w:val="single" w:sz="6" w:space="0" w:color="1D2331"/>
-              <w:left w:val="single" w:sz="6" w:space="0" w:color="1D2331"/>
-              <w:bottom w:val="single" w:sz="6" w:space="0" w:color="1D2331"/>
-              <w:right w:val="single" w:sz="6" w:space="0" w:color="1D2331"/>
+              <w:top w:val="single" w:sz="6" w:space="0" w:color="16C784"/>
+              <w:left w:val="single" w:sz="6" w:space="0" w:color="16C784"/>
+              <w:bottom w:val="single" w:sz="6" w:space="0" w:color="16C784"/>
+              <w:right w:val="single" w:sz="6" w:space="0" w:color="16C784"/>
             </w:tcBorders>
             <w:shd w:val="clear" w:color="auto" w:fill="101828"/>
             <w:tcMar>
@@ -3319,10 +3319,10 @@
           <w:tcPr>
             <w:tcW w:w="10208" w:type="dxa"/>
             <w:tcBorders>
-              <w:top w:val="single" w:sz="6" w:space="0" w:color="1D2331"/>
-              <w:left w:val="single" w:sz="6" w:space="0" w:color="1D2331"/>
-              <w:bottom w:val="single" w:sz="6" w:space="0" w:color="1D2331"/>
-              <w:right w:val="single" w:sz="6" w:space="0" w:color="1D2331"/>
+              <w:top w:val="single" w:sz="6" w:space="0" w:color="16C784"/>
+              <w:left w:val="single" w:sz="6" w:space="0" w:color="16C784"/>
+              <w:bottom w:val="single" w:sz="6" w:space="0" w:color="16C784"/>
+              <w:right w:val="single" w:sz="6" w:space="0" w:color="16C784"/>
             </w:tcBorders>
             <w:shd w:val="clear" w:color="auto" w:fill="101828"/>
             <w:tcMar>
@@ -3903,10 +3903,10 @@
           <w:tcPr>
             <w:tcW w:w="5044" w:type="dxa"/>
             <w:tcBorders>
-              <w:top w:val="single" w:sz="6" w:space="0" w:color="1D2331"/>
-              <w:left w:val="single" w:sz="6" w:space="0" w:color="1D2331"/>
-              <w:bottom w:val="single" w:sz="6" w:space="0" w:color="1D2331"/>
-              <w:right w:val="single" w:sz="6" w:space="0" w:color="1D2331"/>
+              <w:top w:val="single" w:sz="6" w:space="0" w:color="16C784"/>
+              <w:left w:val="single" w:sz="6" w:space="0" w:color="16C784"/>
+              <w:bottom w:val="single" w:sz="6" w:space="0" w:color="16C784"/>
+              <w:right w:val="single" w:sz="6" w:space="0" w:color="16C784"/>
             </w:tcBorders>
             <w:shd w:val="clear" w:color="auto" w:fill="101828"/>
             <w:tcMar>
@@ -4183,10 +4183,10 @@
           <w:tcPr>
             <w:tcW w:w="5044" w:type="dxa"/>
             <w:tcBorders>
-              <w:top w:val="single" w:sz="6" w:space="0" w:color="1D2331"/>
-              <w:left w:val="single" w:sz="6" w:space="0" w:color="1D2331"/>
-              <w:bottom w:val="single" w:sz="6" w:space="0" w:color="1D2331"/>
-              <w:right w:val="single" w:sz="6" w:space="0" w:color="1D2331"/>
+              <w:top w:val="single" w:sz="6" w:space="0" w:color="16C784"/>
+              <w:left w:val="single" w:sz="6" w:space="0" w:color="16C784"/>
+              <w:bottom w:val="single" w:sz="6" w:space="0" w:color="16C784"/>
+              <w:right w:val="single" w:sz="6" w:space="0" w:color="16C784"/>
             </w:tcBorders>
             <w:shd w:val="clear" w:color="auto" w:fill="101828"/>
             <w:tcMar>

</xml_diff>